<commit_message>
docs: update privacy policy to 01.05.2026 revision
New placement date, expanded cookie section (allaboutcookies.org link,
aggregated data usage, consent exceptions), refreshed downloadable docx.

Co-Authored-By: Claude Opus 4.6 <noreply@anthropic.com>
</commit_message>
<xml_diff>
--- a/ezotera-frontend/assets/docs/Политика_конфиденциальности.docx
+++ b/ezotera-frontend/assets/docs/Политика_конфиденциальности.docx
@@ -27,25 +27,22 @@
       <w:pPr>
         <w:spacing w:after="280" w:lineRule="auto"/>
         <w:jc w:val="center"/>
-        <w:rPr/>
-      </w:pPr>
-      <w:r>
-        <w:rPr>
-          <w:rtl w:val="0"/>
-        </w:rPr>
-        <w:t xml:space="preserve">Дата размещения </w:t>
-      </w:r>
-      <w:r>
-        <w:rPr>
-          <w:highlight w:val="yellow"/>
-          <w:rtl w:val="0"/>
-        </w:rPr>
-        <w:t xml:space="preserve">10.11.202г.</w:t>
-      </w:r>
-      <w:r>
-        <w:rPr>
-          <w:rtl w:val="0"/>
-        </w:rPr>
+        <w:rPr>
+          <w:highlight w:val="white"/>
+        </w:rPr>
+      </w:pPr>
+      <w:r>
+        <w:rPr>
+          <w:rtl w:val="0"/>
+        </w:rPr>
+        <w:t xml:space="preserve">Дата размещения</w:t>
+      </w:r>
+      <w:r>
+        <w:rPr>
+          <w:highlight w:val="white"/>
+          <w:rtl w:val="0"/>
+        </w:rPr>
+        <w:t xml:space="preserve"> 01.05.2026 г.</w:t>
       </w:r>
     </w:p>
     <w:p>
@@ -2822,7 +2819,6 @@
     <w:pPr>
       <w:keepNext w:val="0"/>
       <w:keepLines w:val="0"/>
-      <w:pageBreakBefore w:val="0"/>
       <w:widowControl w:val="1"/>
       <w:pBdr>
         <w:top w:space="0" w:sz="0" w:val="nil"/>
@@ -3375,7 +3371,7 @@
 
 <file path=customXML/item1.xml><?xml version="1.0" encoding="utf-8"?>
 <go:gDocsCustomXmlDataStorage xmlns:go="http://customooxmlschemas.google.com/" xmlns:r="http://schemas.openxmlformats.org/officeDocument/2006/relationships" uri="GoogleDocsCustomDataVersion2">
-  <go:docsCustomData xmlns:go="http://customooxmlschemas.google.com/" roundtripDataSignature="AMtx7mgfv+zMEYzzAq460Tyat5S228Ee4g==">CgMxLjA4AHIhMVNTOE1GNWtsRHJvSmxQcTZscGZpVEYzUXNzWXBWVDVn</go:docsCustomData>
+  <go:docsCustomData xmlns:go="http://customooxmlschemas.google.com/" roundtripDataSignature="AMtx7mhvuXOsDlEkHmYv/MU1yO4L38WOqQ==">CgMxLjA4AHIhMTUzME9tdV9VUnpibFI4UG42aW8zel9pRjVTOFBUQTNC</go:docsCustomData>
 </go:gDocsCustomXmlDataStorage>
 </file>
 

</xml_diff>